<commit_message>
updated er diagram to formal chen notation in phase 1 report
</commit_message>
<xml_diff>
--- a/reports/Phase_I_Surplus_Food_Rescue.docx
+++ b/reports/Phase_I_Surplus_Food_Rescue.docx
@@ -2207,7 +2207,7 @@
           <w:color w:val="0F766E"/>
           <w:sz w:val="22"/>
         </w:rPr>
-        <w:t>2.1 Complete Architectural ER Diagram (15 Relational Tables)</w:t>
+        <w:t>2.1 Conceptual Entity-Relationship (ER) Diagram — Peter Chen Notation</w:t>
       </w:r>
     </w:p>
     <w:p>
@@ -2220,7 +2220,7 @@
           <w:color w:val="1E293B"/>
           <w:sz w:val="19"/>
         </w:rPr>
-        <w:t>Below is the architectural Entity-Relationship Diagram illustrating all 15 relational tables, primary keys, composite keys, foreign key references, and cardinalities (1:1, 1:N, M:N):</w:t>
+        <w:t>Below is the formal Entity-Relationship (ER) Diagram designed strictly adhering to Peter Chen (1976) academic conventions: Strong Entities (Rectangles), Weak Entities (Double Rectangles: Food_Batch, Donor_Hours), Relationships (Diamonds: LISTS, CONTAINS, VERIFIES, MAKES, FULFILLS, RATES), Identifying Relationships (Double Diamonds: PRODUCES, OPERATES_ON), Attributes (Ovals with Underlined Primary Keys and Dashed Underlined Discriminators), and explicit Cardinality Ratios (1:1, 1:N, M:N):</w:t>
       </w:r>
     </w:p>
     <w:p>
@@ -2231,7 +2231,7 @@
       <w:r>
         <w:drawing>
           <wp:inline xmlns:a="http://schemas.openxmlformats.org/drawingml/2006/main" xmlns:pic="http://schemas.openxmlformats.org/drawingml/2006/picture">
-            <wp:extent cx="9326880" cy="5246370"/>
+            <wp:extent cx="9326880" cy="6583680"/>
             <wp:docPr id="2" name="Picture 2"/>
             <wp:cNvGraphicFramePr>
               <a:graphicFrameLocks noChangeAspect="1"/>
@@ -2252,7 +2252,7 @@
                   <pic:spPr>
                     <a:xfrm>
                       <a:off x="0" y="0"/>
-                      <a:ext cx="9326880" cy="5246370"/>
+                      <a:ext cx="9326880" cy="6583680"/>
                     </a:xfrm>
                     <a:prstGeom prst="rect"/>
                   </pic:spPr>
@@ -2274,7 +2274,7 @@
           <w:color w:val="64748B"/>
           <w:sz w:val="16"/>
         </w:rPr>
-        <w:t>Figure: Complete High-Resolution ER Diagram with Cardinalities &amp; Keys for Surplus Food Rescue</w:t>
+        <w:t>Figure: Figure: Formal Peter Chen Notation ER Diagram with Weak Entities, Identifying Relationships &amp; Key Attributes</w:t>
       </w:r>
     </w:p>
     <w:p>

</xml_diff>